<commit_message>
Methodological review: add finding 5.6 on LLM retry feedback
</commit_message>
<xml_diff>
--- a/docs/METHODOLOGICAL_REVIEW_GR.docx
+++ b/docs/METHODOLOGICAL_REVIEW_GR.docx
@@ -698,6 +698,68 @@
           </w:p>
         </w:tc>
       </w:tr>
+      <w:tr>
+        <w:tc>
+          <w:tcPr>
+            <w:tcW w:w="328" w:type="dxa"/>
+            <w:shd w:val="clear" w:color="auto" w:fill="F2F5FA"/>
+          </w:tcPr>
+          <w:p>
+            <w:pPr>
+              <w:pStyle w:val="TableText"/>
+            </w:pPr>
+            <w:r>
+              <w:t xml:space="preserve">10</w:t>
+            </w:r>
+          </w:p>
+        </w:tc>
+        <w:tc>
+          <w:tcPr>
+            <w:tcW w:w="4923" w:type="dxa"/>
+            <w:shd w:val="clear" w:color="auto" w:fill="F2F5FA"/>
+          </w:tcPr>
+          <w:p>
+            <w:pPr>
+              <w:pStyle w:val="TableText"/>
+            </w:pPr>
+            <w:r>
+              <w:t xml:space="preserve">Σε retry το LLM δεν λαμβάνει τα validation errors, τα προηγούμενα plans ούτε τα metrics του γύρου</w:t>
+            </w:r>
+          </w:p>
+        </w:tc>
+        <w:tc>
+          <w:tcPr>
+            <w:tcW w:w="2133" w:type="dxa"/>
+            <w:shd w:val="clear" w:color="auto" w:fill="F2F5FA"/>
+          </w:tcPr>
+          <w:p>
+            <w:pPr>
+              <w:pStyle w:val="TableText"/>
+            </w:pPr>
+            <w:r>
+              <w:rPr>
+                <w:b/>
+                <w:color w:val="C55A11"/>
+              </w:rPr>
+              <w:t xml:space="preserve">Σημαντικό</w:t>
+            </w:r>
+          </w:p>
+        </w:tc>
+        <w:tc>
+          <w:tcPr>
+            <w:tcW w:w="1642" w:type="dxa"/>
+            <w:shd w:val="clear" w:color="auto" w:fill="F2F5FA"/>
+          </w:tcPr>
+          <w:p>
+            <w:pPr>
+              <w:pStyle w:val="TableText"/>
+            </w:pPr>
+            <w:r>
+              <w:t xml:space="preserve">Συνεισφορά</w:t>
+            </w:r>
+          </w:p>
+        </w:tc>
+      </w:tr>
     </w:tbl>
     <w:p>
       <w:pPr>
@@ -1493,6 +1555,115 @@
       </w:r>
       <w:r>
         <w:t xml:space="preserve"> Επαναλαμβανόμενες μετρήσεις (π.χ. 5 επαναλήψεις) με σταθερό n_jobs και εναλλασσόμενη σειρά εκτέλεσης conventional και Agentic, αναφορά median και διασποράς, και διαχωρισμός του κόστους LLM από το κόστος αξιολόγησης.</w:t>
+      </w:r>
+    </w:p>
+    <w:p>
+      <w:pPr>
+        <w:pStyle w:val="Heading2"/>
+      </w:pPr>
+      <w:r>
+        <w:t xml:space="preserve">5.6 Το feedback προς το LLM δεν περιέχει την πληροφορία που χρειάζεται για να διορθωθεί</w:t>
+      </w:r>
+    </w:p>
+    <w:p>
+      <w:pPr>
+        <w:pStyle w:val="Normal"/>
+      </w:pPr>
+      <w:r>
+        <w:rPr>
+          <w:b/>
+        </w:rPr>
+        <w:t xml:space="preserve">Τι συμβαίνει.</w:t>
+      </w:r>
+      <w:r>
+        <w:t xml:space="preserve"> Σε κάθε νέο iteration, το GenerateStrategyNode περνά στο prompt ως previous_feedback μόνο τα γενικά μηνύματα recommendations της FeedbackPolicy, π.χ. «Correct the validation issues before generating another plan.», «Generate a materially different preprocessing strategy.» ή «Restore Recall for logistic_regression.». Το LLM δεν λαμβάνει τα συγκεκριμένα validation issues, τα plans που πρότεινε σε προηγούμενους γύρους, ούτε τα deltas PR-AUC, Recall, Precision και runtime που οδήγησαν στο RETRY.</w:t>
+      </w:r>
+    </w:p>
+    <w:p>
+      <w:pPr>
+        <w:pStyle w:val="Normal"/>
+      </w:pPr>
+      <w:r>
+        <w:rPr>
+          <w:b/>
+        </w:rPr>
+        <w:t xml:space="preserve">Τεκμήρια.</w:t>
+      </w:r>
+    </w:p>
+    <w:p>
+      <w:pPr>
+        <w:pStyle w:val="ListBullet"/>
+        <w:numPr>
+          <w:ilvl w:val="0"/>
+          <w:numId w:val="1"/>
+        </w:numPr>
+      </w:pPr>
+      <w:r>
+        <w:t xml:space="preserve">src/agenticai_thesis/agentic/graph.py, γραμμές 123–127: το previous_feedback συντίθεται μόνο από record.feedback.recommendations.</w:t>
+      </w:r>
+    </w:p>
+    <w:p>
+      <w:pPr>
+        <w:pStyle w:val="ListBullet"/>
+        <w:numPr>
+          <w:ilvl w:val="0"/>
+          <w:numId w:val="1"/>
+        </w:numPr>
+      </w:pPr>
+      <w:r>
+        <w:t xml:space="preserve">src/agenticai_thesis/agentic/graph.py, γραμμές 226–233: τα validation issues αποθηκεύονται μόνο ως warnings στο iteration record και δεν φτάνουν στο prompt.</w:t>
+      </w:r>
+    </w:p>
+    <w:p>
+      <w:pPr>
+        <w:pStyle w:val="ListBullet"/>
+        <w:numPr>
+          <w:ilvl w:val="0"/>
+          <w:numId w:val="1"/>
+        </w:numPr>
+      </w:pPr>
+      <w:r>
+        <w:t xml:space="preserve">src/agenticai_thesis/agentic/feedback.py, γραμμή 148: για άκυρο plan η σύσταση είναι ένα γενικό κείμενο χωρίς τα issues.</w:t>
+      </w:r>
+    </w:p>
+    <w:p>
+      <w:pPr>
+        <w:pStyle w:val="ListBullet"/>
+        <w:numPr>
+          <w:ilvl w:val="0"/>
+          <w:numId w:val="1"/>
+        </w:numPr>
+      </w:pPr>
+      <w:r>
+        <w:t xml:space="preserve">Το Deep Dive (§9, validator.py) αναφέρει ότι ο validator επιστρέφει όλα τα issues «ώστε ένα retry να έχει πλήρες feedback», κάτι που δεν ισχύει στην υλοποίηση.</w:t>
+      </w:r>
+    </w:p>
+    <w:p>
+      <w:pPr>
+        <w:pStyle w:val="Normal"/>
+      </w:pPr>
+      <w:r>
+        <w:rPr>
+          <w:b/>
+        </w:rPr>
+        <w:t xml:space="preserve">Γιατί έχει σημασία.</w:t>
+      </w:r>
+      <w:r>
+        <w:t xml:space="preserve"> Η βασική ιδέα ενός agentic loop είναι ότι ο agent βελτιώνει την πρότασή του με βάση το αποτέλεσμα της προηγούμενης. Εδώ, σε κάθε retry το LLM βλέπει ουσιαστικά το ίδιο evidence με τον πρώτο γύρο συν μια γενική οδηγία. Με temperature 0 είναι πολύ πιθανό να ξαναπροτείνει το ίδιο ή σχεδόν το ίδιο plan. Στο επίσημο run το πρόβλημα δεν εμφανίστηκε επειδή δεν έγινε retry, αλλά σε οποιοδήποτε δυσκολότερο σενάριο (βλ. 4.1) θα περιόριζε σοβαρά την ικανότητα του Agent να διορθωθεί. Επομένως ο ισχυρισμός για loop με feedback δεν στηρίζεται ούτε σχεδιαστικά ούτε εμπειρικά.</w:t>
+      </w:r>
+    </w:p>
+    <w:p>
+      <w:pPr>
+        <w:pStyle w:val="Normal"/>
+      </w:pPr>
+      <w:r>
+        <w:rPr>
+          <w:b/>
+        </w:rPr>
+        <w:t xml:space="preserve">Τι πρέπει να γίνει.</w:t>
+      </w:r>
+      <w:r>
+        <w:t xml:space="preserve"> Το GenerateStrategyNode να περνά στο prompt, για κάθε προηγούμενο iteration: το plan που προτάθηκε, τα validation issues (code και message), την απόφαση της policy με το reason_code και τα per-model deltas έναντι του baseline. Να προστεθεί integration test με fake LLM που ελέγχει ότι αυτά εμφανίζονται στο prompt του δεύτερου iteration.</w:t>
       </w:r>
     </w:p>
     <w:p>
@@ -1926,6 +2097,47 @@
           </w:p>
         </w:tc>
       </w:tr>
+      <w:tr>
+        <w:tc>
+          <w:tcPr>
+            <w:tcW w:w="468" w:type="dxa"/>
+          </w:tcPr>
+          <w:p>
+            <w:pPr>
+              <w:pStyle w:val="TableText"/>
+            </w:pPr>
+            <w:r>
+              <w:t xml:space="preserve">9</w:t>
+            </w:r>
+          </w:p>
+        </w:tc>
+        <w:tc>
+          <w:tcPr>
+            <w:tcW w:w="7033" w:type="dxa"/>
+          </w:tcPr>
+          <w:p>
+            <w:pPr>
+              <w:pStyle w:val="TableText"/>
+            </w:pPr>
+            <w:r>
+              <w:t xml:space="preserve">Πλήρες feedback στο prompt: προηγούμενα plans, validation issues, deltas</w:t>
+            </w:r>
+          </w:p>
+        </w:tc>
+        <w:tc>
+          <w:tcPr>
+            <w:tcW w:w="1525" w:type="dxa"/>
+          </w:tcPr>
+          <w:p>
+            <w:pPr>
+              <w:pStyle w:val="TableText"/>
+            </w:pPr>
+            <w:r>
+              <w:t xml:space="preserve">5.6, 5.2</w:t>
+            </w:r>
+          </w:p>
+        </w:tc>
+      </w:tr>
     </w:tbl>
     <w:p>
       <w:pPr>
@@ -2065,6 +2277,18 @@
       </w:pPr>
       <w:r>
         <w:t xml:space="preserve">Ότι το test set αξιολογήθηκε μία μόνο φορά, μέχρι να επιβεβαιωθεί το 4.4.</w:t>
+      </w:r>
+    </w:p>
+    <w:p>
+      <w:pPr>
+        <w:pStyle w:val="ListBullet"/>
+        <w:numPr>
+          <w:ilvl w:val="0"/>
+          <w:numId w:val="1"/>
+        </w:numPr>
+      </w:pPr>
+      <w:r>
+        <w:t xml:space="preserve">Ότι ο Agent μαθαίνει από το feedback των προηγούμενων γύρων· το LLM λαμβάνει μόνο γενικές οδηγίες, χωρίς τα σφάλματα, τα plans ή τα metrics.</w:t>
       </w:r>
     </w:p>
     <w:p>

</xml_diff>